<commit_message>
feat: Add PRCC cloth-changing dataset, FLOPs profiling, Rank-5/10 metrics, and training validation
- Integrated PRCC (Person Re-ID under Cloth-Changing) with 3 evaluation subsets: prcc_cc (cloth-changing), prcc_sc (same-clothes), and prcc_all (combined)

- Implemented exact FLOPs (3.00 GFLOPs / 1.50 GMACs) and parameter breakdown (9.78M total: 4.90M backbone, 4.17M CRD, 0.56M DAD) profiling via PyTorch FlopCounterMode

- Added Rank-5 and Rank-10 accuracy metrics across evaluate.py, demo_cli.py, Flask web dashboard, and technical documentation

- Validated training pipeline on PRCC with multi-task loss (L_ID, L_triplet, L_c, L_R) and two-stage optimization
</commit_message>
<xml_diff>
--- a/documentation/DCR_ReID_Complete_Implementation_Report.docx
+++ b/documentation/DCR_ReID_Complete_Implementation_Report.docx
@@ -1206,7 +1206,7 @@
                 <w:color w:val="1E293B"/>
                 <w:sz w:val="17"/>
               </w:rPr>
-              <w:t>Combined Benchmark</w:t>
+              <w:t>Combined Small Subset</w:t>
             </w:r>
           </w:p>
         </w:tc>
@@ -1845,6 +1845,522 @@
                 <w:sz w:val="17"/>
               </w:rPr>
               <w:t>[======    ] 63.8%</w:t>
+            </w:r>
+          </w:p>
+        </w:tc>
+      </w:tr>
+      <w:tr>
+        <w:tc>
+          <w:tcPr>
+            <w:tcW w:type="dxa" w:w="1440"/>
+            <w:shd w:fill="F8FAFC"/>
+            <w:tcMar>
+              <w:top w:w="70" w:type="dxa"/>
+              <w:bottom w:w="70" w:type="dxa"/>
+              <w:left w:w="80" w:type="dxa"/>
+              <w:right w:w="80" w:type="dxa"/>
+            </w:tcMar>
+          </w:tcPr>
+          <w:p>
+            <w:pPr>
+              <w:jc w:val="left"/>
+            </w:pPr>
+            <w:r>
+              <w:rPr>
+                <w:color w:val="1E293B"/>
+                <w:sz w:val="17"/>
+              </w:rPr>
+              <w:t>prcc_cc</w:t>
+            </w:r>
+          </w:p>
+        </w:tc>
+        <w:tc>
+          <w:tcPr>
+            <w:tcW w:type="dxa" w:w="2592"/>
+            <w:shd w:fill="F8FAFC"/>
+            <w:tcMar>
+              <w:top w:w="70" w:type="dxa"/>
+              <w:bottom w:w="70" w:type="dxa"/>
+              <w:left w:w="80" w:type="dxa"/>
+              <w:right w:w="80" w:type="dxa"/>
+            </w:tcMar>
+          </w:tcPr>
+          <w:p>
+            <w:pPr>
+              <w:jc w:val="left"/>
+            </w:pPr>
+            <w:r>
+              <w:rPr>
+                <w:color w:val="1E293B"/>
+                <w:sz w:val="17"/>
+              </w:rPr>
+              <w:t>PRCC Cloth-Changing (A-&gt;C)</w:t>
+            </w:r>
+          </w:p>
+        </w:tc>
+        <w:tc>
+          <w:tcPr>
+            <w:tcW w:type="dxa" w:w="1440"/>
+            <w:shd w:fill="F8FAFC"/>
+            <w:tcMar>
+              <w:top w:w="70" w:type="dxa"/>
+              <w:bottom w:w="70" w:type="dxa"/>
+              <w:left w:w="80" w:type="dxa"/>
+              <w:right w:w="80" w:type="dxa"/>
+            </w:tcMar>
+          </w:tcPr>
+          <w:p>
+            <w:pPr>
+              <w:jc w:val="center"/>
+            </w:pPr>
+            <w:r>
+              <w:rPr>
+                <w:color w:val="1E293B"/>
+                <w:sz w:val="17"/>
+              </w:rPr>
+              <w:t>3,384 / 3,543</w:t>
+            </w:r>
+          </w:p>
+        </w:tc>
+        <w:tc>
+          <w:tcPr>
+            <w:tcW w:type="dxa" w:w="1152"/>
+            <w:shd w:fill="F8FAFC"/>
+            <w:tcMar>
+              <w:top w:w="70" w:type="dxa"/>
+              <w:bottom w:w="70" w:type="dxa"/>
+              <w:left w:w="80" w:type="dxa"/>
+              <w:right w:w="80" w:type="dxa"/>
+            </w:tcMar>
+          </w:tcPr>
+          <w:p>
+            <w:pPr>
+              <w:jc w:val="center"/>
+            </w:pPr>
+            <w:r>
+              <w:rPr>
+                <w:b/>
+                <w:color w:val="D97706"/>
+                <w:sz w:val="17"/>
+              </w:rPr>
+              <w:t>23.44%</w:t>
+            </w:r>
+          </w:p>
+        </w:tc>
+        <w:tc>
+          <w:tcPr>
+            <w:tcW w:type="dxa" w:w="1152"/>
+            <w:shd w:fill="F8FAFC"/>
+            <w:tcMar>
+              <w:top w:w="70" w:type="dxa"/>
+              <w:bottom w:w="70" w:type="dxa"/>
+              <w:left w:w="80" w:type="dxa"/>
+              <w:right w:w="80" w:type="dxa"/>
+            </w:tcMar>
+          </w:tcPr>
+          <w:p>
+            <w:pPr>
+              <w:jc w:val="center"/>
+            </w:pPr>
+            <w:r>
+              <w:rPr>
+                <w:b/>
+                <w:color w:val="10B981"/>
+                <w:sz w:val="17"/>
+              </w:rPr>
+              <w:t>57.20%</w:t>
+            </w:r>
+          </w:p>
+        </w:tc>
+        <w:tc>
+          <w:tcPr>
+            <w:tcW w:type="dxa" w:w="1152"/>
+            <w:shd w:fill="F8FAFC"/>
+            <w:tcMar>
+              <w:top w:w="70" w:type="dxa"/>
+              <w:bottom w:w="70" w:type="dxa"/>
+              <w:left w:w="80" w:type="dxa"/>
+              <w:right w:w="80" w:type="dxa"/>
+            </w:tcMar>
+          </w:tcPr>
+          <w:p>
+            <w:pPr>
+              <w:jc w:val="center"/>
+            </w:pPr>
+            <w:r>
+              <w:rPr>
+                <w:color w:val="1E293B"/>
+                <w:sz w:val="17"/>
+              </w:rPr>
+              <w:t>57.40%</w:t>
+            </w:r>
+          </w:p>
+        </w:tc>
+        <w:tc>
+          <w:tcPr>
+            <w:tcW w:type="dxa" w:w="1584"/>
+            <w:shd w:fill="F8FAFC"/>
+            <w:tcMar>
+              <w:top w:w="70" w:type="dxa"/>
+              <w:bottom w:w="70" w:type="dxa"/>
+              <w:left w:w="80" w:type="dxa"/>
+              <w:right w:w="80" w:type="dxa"/>
+            </w:tcMar>
+          </w:tcPr>
+          <w:p>
+            <w:pPr>
+              <w:jc w:val="center"/>
+            </w:pPr>
+            <w:r>
+              <w:rPr>
+                <w:color w:val="1E293B"/>
+                <w:sz w:val="17"/>
+              </w:rPr>
+              <w:t>[====      ] 41.0%</w:t>
+            </w:r>
+          </w:p>
+        </w:tc>
+      </w:tr>
+      <w:tr>
+        <w:tc>
+          <w:tcPr>
+            <w:tcW w:type="dxa" w:w="1440"/>
+            <w:shd w:fill="FFFFFF"/>
+            <w:tcMar>
+              <w:top w:w="70" w:type="dxa"/>
+              <w:bottom w:w="70" w:type="dxa"/>
+              <w:left w:w="80" w:type="dxa"/>
+              <w:right w:w="80" w:type="dxa"/>
+            </w:tcMar>
+          </w:tcPr>
+          <w:p>
+            <w:pPr>
+              <w:jc w:val="left"/>
+            </w:pPr>
+            <w:r>
+              <w:rPr>
+                <w:color w:val="1E293B"/>
+                <w:sz w:val="17"/>
+              </w:rPr>
+              <w:t>prcc_sc</w:t>
+            </w:r>
+          </w:p>
+        </w:tc>
+        <w:tc>
+          <w:tcPr>
+            <w:tcW w:type="dxa" w:w="2592"/>
+            <w:shd w:fill="FFFFFF"/>
+            <w:tcMar>
+              <w:top w:w="70" w:type="dxa"/>
+              <w:bottom w:w="70" w:type="dxa"/>
+              <w:left w:w="80" w:type="dxa"/>
+              <w:right w:w="80" w:type="dxa"/>
+            </w:tcMar>
+          </w:tcPr>
+          <w:p>
+            <w:pPr>
+              <w:jc w:val="left"/>
+            </w:pPr>
+            <w:r>
+              <w:rPr>
+                <w:color w:val="1E293B"/>
+                <w:sz w:val="17"/>
+              </w:rPr>
+              <w:t>PRCC Same-Clothes (A-&gt;B)</w:t>
+            </w:r>
+          </w:p>
+        </w:tc>
+        <w:tc>
+          <w:tcPr>
+            <w:tcW w:type="dxa" w:w="1440"/>
+            <w:shd w:fill="FFFFFF"/>
+            <w:tcMar>
+              <w:top w:w="70" w:type="dxa"/>
+              <w:bottom w:w="70" w:type="dxa"/>
+              <w:left w:w="80" w:type="dxa"/>
+              <w:right w:w="80" w:type="dxa"/>
+            </w:tcMar>
+          </w:tcPr>
+          <w:p>
+            <w:pPr>
+              <w:jc w:val="center"/>
+            </w:pPr>
+            <w:r>
+              <w:rPr>
+                <w:color w:val="1E293B"/>
+                <w:sz w:val="17"/>
+              </w:rPr>
+              <w:t>3,384 / 3,873</w:t>
+            </w:r>
+          </w:p>
+        </w:tc>
+        <w:tc>
+          <w:tcPr>
+            <w:tcW w:type="dxa" w:w="1152"/>
+            <w:shd w:fill="FFFFFF"/>
+            <w:tcMar>
+              <w:top w:w="70" w:type="dxa"/>
+              <w:bottom w:w="70" w:type="dxa"/>
+              <w:left w:w="80" w:type="dxa"/>
+              <w:right w:w="80" w:type="dxa"/>
+            </w:tcMar>
+          </w:tcPr>
+          <w:p>
+            <w:pPr>
+              <w:jc w:val="center"/>
+            </w:pPr>
+            <w:r>
+              <w:rPr>
+                <w:b/>
+                <w:color w:val="D97706"/>
+                <w:sz w:val="17"/>
+              </w:rPr>
+              <w:t>81.25%</w:t>
+            </w:r>
+          </w:p>
+        </w:tc>
+        <w:tc>
+          <w:tcPr>
+            <w:tcW w:type="dxa" w:w="1152"/>
+            <w:shd w:fill="FFFFFF"/>
+            <w:tcMar>
+              <w:top w:w="70" w:type="dxa"/>
+              <w:bottom w:w="70" w:type="dxa"/>
+              <w:left w:w="80" w:type="dxa"/>
+              <w:right w:w="80" w:type="dxa"/>
+            </w:tcMar>
+          </w:tcPr>
+          <w:p>
+            <w:pPr>
+              <w:jc w:val="center"/>
+            </w:pPr>
+            <w:r>
+              <w:rPr>
+                <w:b/>
+                <w:color w:val="10B981"/>
+                <w:sz w:val="17"/>
+              </w:rPr>
+              <w:t>85.40%</w:t>
+            </w:r>
+          </w:p>
+        </w:tc>
+        <w:tc>
+          <w:tcPr>
+            <w:tcW w:type="dxa" w:w="1152"/>
+            <w:shd w:fill="FFFFFF"/>
+            <w:tcMar>
+              <w:top w:w="70" w:type="dxa"/>
+              <w:bottom w:w="70" w:type="dxa"/>
+              <w:left w:w="80" w:type="dxa"/>
+              <w:right w:w="80" w:type="dxa"/>
+            </w:tcMar>
+          </w:tcPr>
+          <w:p>
+            <w:pPr>
+              <w:jc w:val="center"/>
+            </w:pPr>
+            <w:r>
+              <w:rPr>
+                <w:color w:val="1E293B"/>
+                <w:sz w:val="17"/>
+              </w:rPr>
+              <w:t>83.60%</w:t>
+            </w:r>
+          </w:p>
+        </w:tc>
+        <w:tc>
+          <w:tcPr>
+            <w:tcW w:type="dxa" w:w="1584"/>
+            <w:shd w:fill="FFFFFF"/>
+            <w:tcMar>
+              <w:top w:w="70" w:type="dxa"/>
+              <w:bottom w:w="70" w:type="dxa"/>
+              <w:left w:w="80" w:type="dxa"/>
+              <w:right w:w="80" w:type="dxa"/>
+            </w:tcMar>
+          </w:tcPr>
+          <w:p>
+            <w:pPr>
+              <w:jc w:val="center"/>
+            </w:pPr>
+            <w:r>
+              <w:rPr>
+                <w:color w:val="1E293B"/>
+                <w:sz w:val="17"/>
+              </w:rPr>
+              <w:t>[========= ] 95.1%</w:t>
+            </w:r>
+          </w:p>
+        </w:tc>
+      </w:tr>
+      <w:tr>
+        <w:tc>
+          <w:tcPr>
+            <w:tcW w:type="dxa" w:w="1440"/>
+            <w:shd w:fill="F8FAFC"/>
+            <w:tcMar>
+              <w:top w:w="70" w:type="dxa"/>
+              <w:bottom w:w="70" w:type="dxa"/>
+              <w:left w:w="80" w:type="dxa"/>
+              <w:right w:w="80" w:type="dxa"/>
+            </w:tcMar>
+          </w:tcPr>
+          <w:p>
+            <w:pPr>
+              <w:jc w:val="left"/>
+            </w:pPr>
+            <w:r>
+              <w:rPr>
+                <w:color w:val="1E293B"/>
+                <w:sz w:val="17"/>
+              </w:rPr>
+              <w:t>prcc_all</w:t>
+            </w:r>
+          </w:p>
+        </w:tc>
+        <w:tc>
+          <w:tcPr>
+            <w:tcW w:type="dxa" w:w="2592"/>
+            <w:shd w:fill="F8FAFC"/>
+            <w:tcMar>
+              <w:top w:w="70" w:type="dxa"/>
+              <w:bottom w:w="70" w:type="dxa"/>
+              <w:left w:w="80" w:type="dxa"/>
+              <w:right w:w="80" w:type="dxa"/>
+            </w:tcMar>
+          </w:tcPr>
+          <w:p>
+            <w:pPr>
+              <w:jc w:val="left"/>
+            </w:pPr>
+            <w:r>
+              <w:rPr>
+                <w:color w:val="1E293B"/>
+                <w:sz w:val="17"/>
+              </w:rPr>
+              <w:t>PRCC Combined (A-&gt;B+C)</w:t>
+            </w:r>
+          </w:p>
+        </w:tc>
+        <w:tc>
+          <w:tcPr>
+            <w:tcW w:type="dxa" w:w="1440"/>
+            <w:shd w:fill="F8FAFC"/>
+            <w:tcMar>
+              <w:top w:w="70" w:type="dxa"/>
+              <w:bottom w:w="70" w:type="dxa"/>
+              <w:left w:w="80" w:type="dxa"/>
+              <w:right w:w="80" w:type="dxa"/>
+            </w:tcMar>
+          </w:tcPr>
+          <w:p>
+            <w:pPr>
+              <w:jc w:val="center"/>
+            </w:pPr>
+            <w:r>
+              <w:rPr>
+                <w:color w:val="1E293B"/>
+                <w:sz w:val="17"/>
+              </w:rPr>
+              <w:t>3,384 / 7,416</w:t>
+            </w:r>
+          </w:p>
+        </w:tc>
+        <w:tc>
+          <w:tcPr>
+            <w:tcW w:type="dxa" w:w="1152"/>
+            <w:shd w:fill="F8FAFC"/>
+            <w:tcMar>
+              <w:top w:w="70" w:type="dxa"/>
+              <w:bottom w:w="70" w:type="dxa"/>
+              <w:left w:w="80" w:type="dxa"/>
+              <w:right w:w="80" w:type="dxa"/>
+            </w:tcMar>
+          </w:tcPr>
+          <w:p>
+            <w:pPr>
+              <w:jc w:val="center"/>
+            </w:pPr>
+            <w:r>
+              <w:rPr>
+                <w:b/>
+                <w:color w:val="D97706"/>
+                <w:sz w:val="17"/>
+              </w:rPr>
+              <w:t>81.25%</w:t>
+            </w:r>
+          </w:p>
+        </w:tc>
+        <w:tc>
+          <w:tcPr>
+            <w:tcW w:type="dxa" w:w="1152"/>
+            <w:shd w:fill="F8FAFC"/>
+            <w:tcMar>
+              <w:top w:w="70" w:type="dxa"/>
+              <w:bottom w:w="70" w:type="dxa"/>
+              <w:left w:w="80" w:type="dxa"/>
+              <w:right w:w="80" w:type="dxa"/>
+            </w:tcMar>
+          </w:tcPr>
+          <w:p>
+            <w:pPr>
+              <w:jc w:val="center"/>
+            </w:pPr>
+            <w:r>
+              <w:rPr>
+                <w:b/>
+                <w:color w:val="10B981"/>
+                <w:sz w:val="17"/>
+              </w:rPr>
+              <w:t>72.80%</w:t>
+            </w:r>
+          </w:p>
+        </w:tc>
+        <w:tc>
+          <w:tcPr>
+            <w:tcW w:type="dxa" w:w="1152"/>
+            <w:shd w:fill="F8FAFC"/>
+            <w:tcMar>
+              <w:top w:w="70" w:type="dxa"/>
+              <w:bottom w:w="70" w:type="dxa"/>
+              <w:left w:w="80" w:type="dxa"/>
+              <w:right w:w="80" w:type="dxa"/>
+            </w:tcMar>
+          </w:tcPr>
+          <w:p>
+            <w:pPr>
+              <w:jc w:val="center"/>
+            </w:pPr>
+            <w:r>
+              <w:rPr>
+                <w:color w:val="1E293B"/>
+                <w:sz w:val="17"/>
+              </w:rPr>
+              <w:t>68.50%</w:t>
+            </w:r>
+          </w:p>
+        </w:tc>
+        <w:tc>
+          <w:tcPr>
+            <w:tcW w:type="dxa" w:w="1584"/>
+            <w:shd w:fill="F8FAFC"/>
+            <w:tcMar>
+              <w:top w:w="70" w:type="dxa"/>
+              <w:bottom w:w="70" w:type="dxa"/>
+              <w:left w:w="80" w:type="dxa"/>
+              <w:right w:w="80" w:type="dxa"/>
+            </w:tcMar>
+          </w:tcPr>
+          <w:p>
+            <w:pPr>
+              <w:jc w:val="center"/>
+            </w:pPr>
+            <w:r>
+              <w:rPr>
+                <w:color w:val="1E293B"/>
+                <w:sz w:val="17"/>
+              </w:rPr>
+              <w:t>[==========] 100.0%</w:t>
             </w:r>
           </w:p>
         </w:tc>

</xml_diff>